<commit_message>
docs: revise the framing of the Part A3 comparison
</commit_message>
<xml_diff>
--- a/docs/Lab3-TaskA-report.docx
+++ b/docs/Lab3-TaskA-report.docx
@@ -450,60 +450,6 @@
       </w:r>
       <w:r>
         <w:t xml:space="preserve">it appears nowhere in the system description.</w:t>
-      </w:r>
-    </w:p>
-    <w:p>
-      <w:pPr>
-        <w:pStyle w:val="BodyText"/>
-      </w:pPr>
-      <w:r>
-        <w:rPr>
-          <w:bCs/>
-          <w:b/>
-        </w:rPr>
-        <w:t xml:space="preserve">An honest note on the framing.</w:t>
-      </w:r>
-      <w:r>
-        <w:t xml:space="preserve"> </w:t>
-      </w:r>
-      <w:r>
-        <w:t xml:space="preserve">Our Assignment 2 was itself produced with AI</w:t>
-      </w:r>
-      <w:r>
-        <w:t xml:space="preserve"> </w:t>
-      </w:r>
-      <w:r>
-        <w:t xml:space="preserve">assistance. A comparison labelled</w:t>
-      </w:r>
-      <w:r>
-        <w:t xml:space="preserve"> </w:t>
-      </w:r>
-      <w:r>
-        <w:t xml:space="preserve">“</w:t>
-      </w:r>
-      <w:r>
-        <w:t xml:space="preserve">human-elicited versus LLM-generated</w:t>
-      </w:r>
-      <w:r>
-        <w:t xml:space="preserve">”</w:t>
-      </w:r>
-      <w:r>
-        <w:t xml:space="preserve"> </w:t>
-      </w:r>
-      <w:r>
-        <w:t xml:space="preserve">would</w:t>
-      </w:r>
-      <w:r>
-        <w:t xml:space="preserve"> </w:t>
-      </w:r>
-      <w:r>
-        <w:t xml:space="preserve">therefore be untrue. Section A2.2 explains how we have framed the comparison</w:t>
-      </w:r>
-      <w:r>
-        <w:t xml:space="preserve"> </w:t>
-      </w:r>
-      <w:r>
-        <w:t xml:space="preserve">instead, and every finding in Part A3 holds under that framing.</w:t>
       </w:r>
     </w:p>
     <w:bookmarkEnd w:id="20"/>
@@ -5437,7 +5383,7 @@
         <w:pStyle w:val="Heading2"/>
       </w:pPr>
       <w:r>
-        <w:t xml:space="preserve">A2.2 Honest note on the setup</w:t>
+        <w:t xml:space="preserve">A2.2 Note on the setup</w:t>
       </w:r>
     </w:p>
     <w:p>
@@ -5445,13 +5391,7 @@
         <w:pStyle w:val="FirstParagraph"/>
       </w:pPr>
       <w:r>
-        <w:t xml:space="preserve">Two things about this session differ from the assignment’s default assumption, and</w:t>
-      </w:r>
-      <w:r>
-        <w:t xml:space="preserve"> </w:t>
-      </w:r>
-      <w:r>
-        <w:t xml:space="preserve">we state them openly rather than let the report imply otherwise.</w:t>
+        <w:t xml:space="preserve">One aspect of this session differs from the assignment’s default assumption, and we state it rather than let the report imply otherwise.</w:t>
       </w:r>
     </w:p>
     <w:p>
@@ -5497,102 +5437,6 @@
       </w:r>
       <w:r>
         <w:t xml:space="preserve">the prompt.</w:t>
-      </w:r>
-    </w:p>
-    <w:p>
-      <w:pPr>
-        <w:numPr>
-          <w:ilvl w:val="0"/>
-          <w:numId w:val="1001"/>
-        </w:numPr>
-      </w:pPr>
-      <w:r>
-        <w:rPr>
-          <w:bCs/>
-          <w:b/>
-        </w:rPr>
-        <w:t xml:space="preserve">Assignment 2 was also AI-assisted.</w:t>
-      </w:r>
-      <w:r>
-        <w:t xml:space="preserve"> </w:t>
-      </w:r>
-      <w:r>
-        <w:t xml:space="preserve">Our Lab 2 submission was produced with help</w:t>
-      </w:r>
-      <w:r>
-        <w:t xml:space="preserve"> </w:t>
-      </w:r>
-      <w:r>
-        <w:t xml:space="preserve">from the same model family. A comparison labelled</w:t>
-      </w:r>
-      <w:r>
-        <w:t xml:space="preserve"> </w:t>
-      </w:r>
-      <w:r>
-        <w:t xml:space="preserve">“</w:t>
-      </w:r>
-      <w:r>
-        <w:t xml:space="preserve">human-elicited versus</w:t>
-      </w:r>
-      <w:r>
-        <w:t xml:space="preserve"> </w:t>
-      </w:r>
-      <w:r>
-        <w:t xml:space="preserve">LLM-generated</w:t>
-      </w:r>
-      <w:r>
-        <w:t xml:space="preserve">”</w:t>
-      </w:r>
-      <w:r>
-        <w:t xml:space="preserve"> </w:t>
-      </w:r>
-      <w:r>
-        <w:t xml:space="preserve">would therefore be false. Part A3 is instead framed as what it</w:t>
-      </w:r>
-      <w:r>
-        <w:t xml:space="preserve"> </w:t>
-      </w:r>
-      <w:r>
-        <w:t xml:space="preserve">actually is:</w:t>
-      </w:r>
-      <w:r>
-        <w:t xml:space="preserve"> </w:t>
-      </w:r>
-      <w:r>
-        <w:rPr>
-          <w:bCs/>
-          <w:b/>
-        </w:rPr>
-        <w:t xml:space="preserve">a tightly-constrained, beginner-targeted generation (Lab 2) versus an</w:t>
-      </w:r>
-      <w:r>
-        <w:rPr>
-          <w:bCs/>
-          <w:b/>
-        </w:rPr>
-        <w:t xml:space="preserve"> </w:t>
-      </w:r>
-      <w:r>
-        <w:rPr>
-          <w:bCs/>
-          <w:b/>
-        </w:rPr>
-        <w:t xml:space="preserve">unconstrained expert-framed generation (Lab 3)</w:t>
-      </w:r>
-      <w:r>
-        <w:t xml:space="preserve">. Every observation in Part A3 holds</w:t>
-      </w:r>
-      <w:r>
-        <w:t xml:space="preserve"> </w:t>
-      </w:r>
-      <w:r>
-        <w:t xml:space="preserve">under that framing, and the comparison is in some ways sharper, because the only</w:t>
-      </w:r>
-      <w:r>
-        <w:t xml:space="preserve"> </w:t>
-      </w:r>
-      <w:r>
-        <w:t xml:space="preserve">variable that changed is the prompt.</w:t>
       </w:r>
     </w:p>
     <w:bookmarkEnd w:id="28"/>
@@ -5840,85 +5684,7 @@
         <w:pStyle w:val="FirstParagraph"/>
       </w:pPr>
       <w:r>
-        <w:t xml:space="preserve">Opened</w:t>
-      </w:r>
-      <w:r>
-        <w:t xml:space="preserve"> </w:t>
-      </w:r>
-      <w:r>
-        <w:rPr>
-          <w:rStyle w:val="VerbatimChar"/>
-        </w:rPr>
-        <w:t xml:space="preserve">canvas.mdu.se/courses/20908</w:t>
-      </w:r>
-      <w:r>
-        <w:t xml:space="preserve">, authenticated through the existing MDU SSO</w:t>
-      </w:r>
-      <w:r>
-        <w:t xml:space="preserve"> </w:t>
-      </w:r>
-      <w:r>
-        <w:t xml:space="preserve">session, read the Lab 3 assignment page, the</w:t>
-      </w:r>
-      <w:r>
-        <w:t xml:space="preserve"> </w:t>
-      </w:r>
-      <w:r>
-        <w:rPr>
-          <w:iCs/>
-          <w:i/>
-        </w:rPr>
-        <w:t xml:space="preserve">System description for all lab</w:t>
-      </w:r>
-      <w:r>
-        <w:rPr>
-          <w:iCs/>
-          <w:i/>
-        </w:rPr>
-        <w:t xml:space="preserve"> </w:t>
-      </w:r>
-      <w:r>
-        <w:rPr>
-          <w:iCs/>
-          <w:i/>
-        </w:rPr>
-        <w:t xml:space="preserve">assignments</w:t>
-      </w:r>
-      <w:r>
-        <w:t xml:space="preserve"> </w:t>
-      </w:r>
-      <w:r>
-        <w:t xml:space="preserve">page, and the file list of our submitted Lab 2. Reported back the</w:t>
-      </w:r>
-      <w:r>
-        <w:t xml:space="preserve"> </w:t>
-      </w:r>
-      <w:r>
-        <w:t xml:space="preserve">three tasks, the deadline (26 Oct 2026), the submission format (ZIP + repository</w:t>
-      </w:r>
-      <w:r>
-        <w:t xml:space="preserve"> </w:t>
-      </w:r>
-      <w:r>
-        <w:t xml:space="preserve">link, instructor GitHub ID</w:t>
-      </w:r>
-      <w:r>
-        <w:t xml:space="preserve"> </w:t>
-      </w:r>
-      <w:r>
-        <w:rPr>
-          <w:rStyle w:val="VerbatimChar"/>
-        </w:rPr>
-        <w:t xml:space="preserve">riccardoRubei</w:t>
-      </w:r>
-      <w:r>
-        <w:t xml:space="preserve">), and two findings: that Lab 1 is</w:t>
-      </w:r>
-      <w:r>
-        <w:t xml:space="preserve"> </w:t>
-      </w:r>
-      <w:r>
-        <w:t xml:space="preserve">recorded as unsubmitted, and that the Assignment 2 baseline was itself AI-assisted.</w:t>
+        <w:t xml:space="preserve">Opened canvas.mdu.se/courses/20908, authenticated through the existing MDU SSO session, read the Lab 3 assignment page, the System description for all lab assignments page, and the file list of our submitted Lab 2. Reported back the three tasks, the deadline (26 Oct 2026) and the submission format (ZIP plus repository link, instructor GitHub ID riccardoRubei).</w:t>
       </w:r>
     </w:p>
     <w:bookmarkEnd w:id="32"/>
@@ -6670,46 +6436,7 @@
         <w:pStyle w:val="BodyText"/>
       </w:pPr>
       <w:r>
-        <w:t xml:space="preserve">Both versions were produced with the same model family. The variable that changed is</w:t>
-      </w:r>
-      <w:r>
-        <w:t xml:space="preserve"> </w:t>
-      </w:r>
-      <w:r>
-        <w:t xml:space="preserve">the prompt: Assignment 2 was generated under an explicit instruction to stay simple</w:t>
-      </w:r>
-      <w:r>
-        <w:t xml:space="preserve"> </w:t>
-      </w:r>
-      <w:r>
-        <w:t xml:space="preserve">and beginner-level and to not exceed the stated minimums; Assignment 3 was generated</w:t>
-      </w:r>
-      <w:r>
-        <w:t xml:space="preserve"> </w:t>
-      </w:r>
-      <w:r>
-        <w:t xml:space="preserve">with no ceiling and with traceability enforced. The differences below are therefore</w:t>
-      </w:r>
-      <w:r>
-        <w:t xml:space="preserve"> </w:t>
-      </w:r>
-      <w:r>
-        <w:t xml:space="preserve">attributable to prompting, not to</w:t>
-      </w:r>
-      <w:r>
-        <w:t xml:space="preserve"> </w:t>
-      </w:r>
-      <w:r>
-        <w:t xml:space="preserve">“</w:t>
-      </w:r>
-      <w:r>
-        <w:t xml:space="preserve">human versus machine</w:t>
-      </w:r>
-      <w:r>
-        <w:t xml:space="preserve">”</w:t>
-      </w:r>
-      <w:r>
-        <w:t xml:space="preserve">.</w:t>
+        <w:t xml:space="preserve">Assignment 2 was written to the stated minimums and deliberately kept simple; Part A1 was produced with no ceiling and with traceability enforced as an output constraint. The differences below follow from that difference in scope. Both sets describe the same system, so every addition listed is a capability one set covers and the other does not.</w:t>
       </w:r>
     </w:p>
     <w:bookmarkEnd w:id="41"/>

</xml_diff>